<commit_message>
Add Word (.docx) versions of all course docs + Figma build sheets
Audience-friendly Word versions, brand-styled (ink/green/Inter, branded
footer), generated from the Markdown sources:
- Sibling .docx next to every .md except README (course kit, data dictionary,
  facilitator guide, run-of-shows, solutions, exercises, prompts, capstone,
  community) — tables and code blocks preserved
- handouts/: ready-to-share student bundle + per-session Figma build sheets
  (paste-ready slide content for editing the native Figma Slides template)

Also fixes a heading and adds italic support in the md->docx conversion.

Co-Authored-By: Claude Opus 4.8 <noreply@anthropic.com>
</commit_message>
<xml_diff>
--- a/handouts/AI-for-Excel-Prompt-Cheat-Sheet.docx
+++ b/handouts/AI-for-Excel-Prompt-Cheat-Sheet.docx
@@ -594,7 +594,24 @@
           <w:color w:val="3A3D38"/>
           <w:sz w:val="22"/>
         </w:rPr>
-        <w:t>. Explain *why* it's failing and give me a corrected version.</w:t>
+        <w:t xml:space="preserve">. Explain </w:t>
+      </w:r>
+      <w:r>
+        <w:rPr>
+          <w:rFonts w:ascii="Calibri" w:hAnsi="Calibri"/>
+          <w:i/>
+          <w:color w:val="3A3D38"/>
+          <w:sz w:val="22"/>
+        </w:rPr>
+        <w:t>why</w:t>
+      </w:r>
+      <w:r>
+        <w:rPr>
+          <w:rFonts w:ascii="Calibri" w:hAnsi="Calibri"/>
+          <w:color w:val="3A3D38"/>
+          <w:sz w:val="22"/>
+        </w:rPr>
+        <w:t xml:space="preserve"> it's failing and give me a corrected version.</w:t>
       </w:r>
     </w:p>
     <w:p>

</xml_diff>